<commit_message>
update docker file with correct env
</commit_message>
<xml_diff>
--- a/Docker/EITN/EITN_Setup_Guide.docx
+++ b/Docker/EITN/EITN_Setup_Guide.docx
@@ -156,7 +156,7 @@
           </w:tcPr>
           <w:p>
             <w:r>
-              <w:t>NEURON 8.2.6, TVB 2.10, mpi4py</w:t>
+              <w:t>NEURON 8.2.6, mpi4py</w:t>
             </w:r>
           </w:p>
         </w:tc>
@@ -198,7 +198,7 @@
           </w:tcPr>
           <w:p>
             <w:r>
-              <w:t>BSB 7.6, NEURON 9.0, TVB 2.10, mpi4py</w:t>
+              <w:t>BSB (next branch), NEST 3.8, JupyterLab, cerebellar-models, mpi4py</w:t>
             </w:r>
           </w:p>
         </w:tc>
@@ -208,7 +208,7 @@
           </w:tcPr>
           <w:p>
             <w:r>
-              <w:t>BSB + NEURON workflows</w:t>
+              <w:t>BSB + NEST + cerebellar-models workflows</w:t>
             </w:r>
           </w:p>
         </w:tc>
@@ -240,7 +240,7 @@
           </w:tcPr>
           <w:p>
             <w:r>
-              <w:t>BSB 7.6, NEST 3.8, TVB 2.10, JupyterLab, cerebellar-models</w:t>
+              <w:t>BSB, NEST 3.8, JupyterLab, cerebellar-models, mpi4py</w:t>
             </w:r>
           </w:p>
         </w:tc>
@@ -395,7 +395,7 @@
     </w:p>
     <w:p>
       <w:r>
-        <w:t>A pre-built image is provided as eitn-devenv.tar.gz (~1.4 GB). This skips the build step entirely.</w:t>
+        <w:t>A pre-built image is provided as eitn-devenv.tar.gz (~1.2 GB). This skips the build step entirely.</w:t>
       </w:r>
     </w:p>
     <w:p>
@@ -479,7 +479,7 @@
         <w:pStyle w:val="Heading2"/>
       </w:pPr>
       <w:r>
-        <w:t>nrn — NEURON 8.2.6 + TVB</w:t>
+        <w:t>nrn — NEURON 8.2.6</w:t>
       </w:r>
     </w:p>
     <w:p>
@@ -551,28 +551,6 @@
           </w:tcPr>
           <w:p>
             <w:r>
-              <w:t>TVB (tvb-library + tvb-contrib)</w:t>
-            </w:r>
-          </w:p>
-        </w:tc>
-        <w:tc>
-          <w:tcPr>
-            <w:tcW w:type="dxa" w:w="4320"/>
-          </w:tcPr>
-          <w:p>
-            <w:r>
-              <w:t>2.10.0</w:t>
-            </w:r>
-          </w:p>
-        </w:tc>
-      </w:tr>
-      <w:tr>
-        <w:tc>
-          <w:tcPr>
-            <w:tcW w:type="dxa" w:w="4320"/>
-          </w:tcPr>
-          <w:p>
-            <w:r>
               <w:t>mpi4py</w:t>
             </w:r>
           </w:p>
@@ -588,6 +566,24 @@
           </w:p>
         </w:tc>
       </w:tr>
+      <w:tr>
+        <w:tc>
+          <w:tcPr>
+            <w:tcW w:type="dxa" w:w="4320"/>
+          </w:tcPr>
+          <w:p>
+            <w:r/>
+          </w:p>
+        </w:tc>
+        <w:tc>
+          <w:tcPr>
+            <w:tcW w:type="dxa" w:w="4320"/>
+          </w:tcPr>
+          <w:p>
+            <w:r/>
+          </w:p>
+        </w:tc>
+      </w:tr>
     </w:tbl>
     <w:p/>
     <w:p>
@@ -595,7 +591,7 @@
         <w:pStyle w:val="Heading2"/>
       </w:pPr>
       <w:r>
-        <w:t>bsb — BSB + NEURON 9.x + TVB</w:t>
+        <w:t>bsb — BSB (next) + NEST 3.8 + Jupyter + cerebellar-models</w:t>
       </w:r>
     </w:p>
     <w:p>
@@ -655,7 +651,7 @@
           </w:tcPr>
           <w:p>
             <w:r>
-              <w:t>7.6.0</w:t>
+              <w:t>next branch</w:t>
             </w:r>
           </w:p>
         </w:tc>
@@ -667,7 +663,7 @@
           </w:tcPr>
           <w:p>
             <w:r>
-              <w:t>NEURON</w:t>
+              <w:t>NEST simulator</w:t>
             </w:r>
           </w:p>
         </w:tc>
@@ -677,7 +673,7 @@
           </w:tcPr>
           <w:p>
             <w:r>
-              <w:t>9.0.2</w:t>
+              <w:t>3.8.0</w:t>
             </w:r>
           </w:p>
         </w:tc>
@@ -689,7 +685,7 @@
           </w:tcPr>
           <w:p>
             <w:r>
-              <w:t>TVB (tvb-library + tvb-contrib)</w:t>
+              <w:t>JupyterLab</w:t>
             </w:r>
           </w:p>
         </w:tc>
@@ -699,7 +695,7 @@
           </w:tcPr>
           <w:p>
             <w:r>
-              <w:t>2.10.0</w:t>
+              <w:t>4.6.3</w:t>
             </w:r>
           </w:p>
         </w:tc>
@@ -711,7 +707,7 @@
           </w:tcPr>
           <w:p>
             <w:r>
-              <w:t>mpi4py</w:t>
+              <w:t>cerebellar-models</w:t>
             </w:r>
           </w:p>
         </w:tc>
@@ -721,7 +717,7 @@
           </w:tcPr>
           <w:p>
             <w:r>
-              <w:t>4.1.2</w:t>
+              <w:t>latest</w:t>
             </w:r>
           </w:p>
         </w:tc>
@@ -733,7 +729,7 @@
         <w:pStyle w:val="Heading2"/>
       </w:pPr>
       <w:r>
-        <w:t>mfm — BSB + NEST 3.8 + TVB + Jupyter + cerebellar-models</w:t>
+        <w:t>mfm — BSB + NEST 3.8 + Jupyter + cerebellar-models</w:t>
       </w:r>
     </w:p>
     <w:p>
@@ -827,28 +823,6 @@
           </w:tcPr>
           <w:p>
             <w:r>
-              <w:t>TVB (tvb-library + tvb-contrib)</w:t>
-            </w:r>
-          </w:p>
-        </w:tc>
-        <w:tc>
-          <w:tcPr>
-            <w:tcW w:type="dxa" w:w="4320"/>
-          </w:tcPr>
-          <w:p>
-            <w:r>
-              <w:t>2.10.0</w:t>
-            </w:r>
-          </w:p>
-        </w:tc>
-      </w:tr>
-      <w:tr>
-        <w:tc>
-          <w:tcPr>
-            <w:tcW w:type="dxa" w:w="4320"/>
-          </w:tcPr>
-          <w:p>
-            <w:r>
               <w:t>JupyterLab</w:t>
             </w:r>
           </w:p>
@@ -908,11 +882,29 @@
           </w:p>
         </w:tc>
       </w:tr>
+      <w:tr>
+        <w:tc>
+          <w:tcPr>
+            <w:tcW w:type="dxa" w:w="4320"/>
+          </w:tcPr>
+          <w:p>
+            <w:r/>
+          </w:p>
+        </w:tc>
+        <w:tc>
+          <w:tcPr>
+            <w:tcW w:type="dxa" w:w="4320"/>
+          </w:tcPr>
+          <w:p>
+            <w:r/>
+          </w:p>
+        </w:tc>
+      </w:tr>
     </w:tbl>
     <w:p/>
     <w:p>
       <w:r>
-        <w:t>To start JupyterLab from the mfm environment:</w:t>
+        <w:t>To start JupyterLab (available in both bsb and mfm):</w:t>
       </w:r>
     </w:p>
     <w:p>
@@ -933,7 +925,10 @@
     </w:p>
     <w:p>
       <w:r>
-        <w:t>Then open http://localhost:8080 in your browser and paste the token shown in the terminal.</w:t>
+        <w:rPr>
+          <w:sz w:val="22"/>
+        </w:rPr>
+        <w:t>Then open http://localhost:8080 in your browser. Copy the full URL with the token from the terminal output (it looks like http://localhost:8080/?token=abc123...). JupyterLab requires this token to authenticate — do not change the port, as 8080 is the one forwarded by Docker.</w:t>
       </w:r>
     </w:p>
     <w:p>

</xml_diff>

<commit_message>
update guide to build with apple laptops
</commit_message>
<xml_diff>
--- a/Docker/EITN/EITN_Setup_Guide.docx
+++ b/Docker/EITN/EITN_Setup_Guide.docx
@@ -38,7 +38,7 @@
         <w:jc w:val="center"/>
       </w:pPr>
       <w:r>
-        <w:t>for macOS and Windows users</w:t>
+        <w:t>for macOS, Windows and Linux users</w:t>
       </w:r>
     </w:p>
     <w:p>
@@ -414,6 +414,133 @@
     </w:p>
     <w:p>
       <w:pPr>
+        <w:pStyle w:val="Titolo2"/>
+      </w:pPr>
+      <w:r>
+        <w:t>Linux (Ubuntu / Fedora)</w:t>
+      </w:r>
+    </w:p>
+    <w:p>
+      <w:pPr/>
+      <w:r>
+        <w:t>Linux does not need Docker Desktop — install the Docker Engine directly.</w:t>
+      </w:r>
+    </w:p>
+    <w:p>
+      <w:pPr>
+        <w:pStyle w:val="Titolo3"/>
+      </w:pPr>
+      <w:r>
+        <w:t>Ubuntu</w:t>
+      </w:r>
+    </w:p>
+    <w:p>
+      <w:pPr>
+        <w:pStyle w:val="CodeBlock"/>
+      </w:pPr>
+      <w:r>
+        <w:t># Remove any pre-installed Docker snap or apt packages</w:t>
+        <w:br/>
+        <w:t>sudo snap remove docker 2&gt;/dev/null || true</w:t>
+        <w:br/>
+        <w:t>sudo apt-get remove -y docker.io docker-doc \</w:t>
+        <w:br/>
+        <w:t xml:space="preserve">  docker-compose podman-docker containerd runc 2&gt;/dev/null || true</w:t>
+        <w:br/>
+        <w:br/>
+        <w:t>sudo apt-get update</w:t>
+        <w:br/>
+        <w:t>sudo apt-get install -y ca-certificates curl</w:t>
+        <w:br/>
+        <w:t>sudo install -m 0755 -d /etc/apt/keyrings</w:t>
+        <w:br/>
+        <w:t>sudo curl -fsSL https://download.docker.com/linux/ubuntu/gpg \</w:t>
+        <w:br/>
+        <w:t xml:space="preserve">  -o /etc/apt/keyrings/docker.asc</w:t>
+        <w:br/>
+        <w:t>sudo chmod a+r /etc/apt/keyrings/docker.asc</w:t>
+        <w:br/>
+        <w:t>echo "deb [arch=$(dpkg --print-architecture) \</w:t>
+        <w:br/>
+        <w:t xml:space="preserve">  signed-by=/etc/apt/keyrings/docker.asc] \</w:t>
+        <w:br/>
+        <w:t xml:space="preserve">  https://download.docker.com/linux/ubuntu \</w:t>
+        <w:br/>
+        <w:t xml:space="preserve">  $(. /etc/os-release &amp;&amp; echo $VERSION_CODENAME) stable" \</w:t>
+        <w:br/>
+        <w:t xml:space="preserve">  | sudo tee /etc/apt/sources.list.d/docker.list &gt; /dev/null</w:t>
+        <w:br/>
+        <w:t>sudo apt-get update</w:t>
+        <w:br/>
+        <w:t>sudo apt-get install -y docker-ce docker-ce-cli \</w:t>
+        <w:br/>
+        <w:t xml:space="preserve">  containerd.io docker-compose-plugin</w:t>
+      </w:r>
+    </w:p>
+    <w:p>
+      <w:pPr>
+        <w:pStyle w:val="Titolo3"/>
+      </w:pPr>
+      <w:r>
+        <w:t>Fedora</w:t>
+      </w:r>
+    </w:p>
+    <w:p>
+      <w:pPr>
+        <w:pStyle w:val="CodeBlock"/>
+      </w:pPr>
+      <w:r>
+        <w:t>sudo dnf -y install dnf-plugins-core</w:t>
+        <w:br/>
+        <w:t>sudo dnf config-manager --add-repo \</w:t>
+        <w:br/>
+        <w:t xml:space="preserve">  https://download.docker.com/linux/fedora/docker-ce.repo</w:t>
+        <w:br/>
+        <w:t>sudo dnf install -y docker-ce docker-ce-cli \</w:t>
+        <w:br/>
+        <w:t xml:space="preserve">  containerd.io docker-compose-plugin</w:t>
+        <w:br/>
+        <w:t>sudo systemctl enable --now docker</w:t>
+      </w:r>
+    </w:p>
+    <w:p>
+      <w:pPr>
+        <w:pStyle w:val="Titolo3"/>
+      </w:pPr>
+      <w:r>
+        <w:t>Allow your user to run Docker</w:t>
+      </w:r>
+    </w:p>
+    <w:p>
+      <w:pPr/>
+      <w:r>
+        <w:t>By default only root can use Docker. Add your user to the docker group so you can run commands without sudo:</w:t>
+      </w:r>
+    </w:p>
+    <w:p>
+      <w:pPr>
+        <w:pStyle w:val="CodeBlock"/>
+      </w:pPr>
+      <w:r>
+        <w:t>sudo usermod -aG docker $USER</w:t>
+      </w:r>
+    </w:p>
+    <w:p>
+      <w:pPr/>
+      <w:r>
+        <w:t>Log out and back in (or run newgrp docker) for the change to take effect. Verify with:</w:t>
+      </w:r>
+    </w:p>
+    <w:p>
+      <w:pPr>
+        <w:pStyle w:val="CodeBlock"/>
+      </w:pPr>
+      <w:r>
+        <w:t>docker run hello-world</w:t>
+      </w:r>
+    </w:p>
+    <w:p>
+      <w:pPr>
         <w:pStyle w:val="Titolo1"/>
       </w:pPr>
       <w:r>
@@ -439,6 +566,14 @@
       </w:pPr>
       <w:r>
         <w:t>Windows: open the EITN folder in Explorer, click the address bar, type powershell, press Enter.</w:t>
+      </w:r>
+    </w:p>
+    <w:p>
+      <w:pPr>
+        <w:pStyle w:val="Puntoelenco"/>
+      </w:pPr>
+      <w:r>
+        <w:t>Linux: open a terminal and cd into the EITN folder.</w:t>
       </w:r>
     </w:p>
     <w:p/>
@@ -467,6 +602,12 @@
       </w:r>
     </w:p>
     <w:p>
+      <w:pPr/>
+      <w:r>
+        <w:t>The pre-built image is x86-64 (Intel/AMD). On Apple-silicon Macs it runs under Rosetta emulation. For native ARM performance, use Option B with PLATFORM=linux/arm64 instead.</w:t>
+      </w:r>
+    </w:p>
+    <w:p>
       <w:pPr>
         <w:pStyle w:val="Titolo2"/>
       </w:pPr>
@@ -488,6 +629,26 @@
       </w:pPr>
       <w:r>
         <w:t>docker compose build</w:t>
+      </w:r>
+    </w:p>
+    <w:p>
+      <w:pPr/>
+      <w:r>
+        <w:t>On a Mac with Apple silicon (M1/M2/M3/M4), build the ARM image instead:</w:t>
+      </w:r>
+    </w:p>
+    <w:p>
+      <w:pPr>
+        <w:pStyle w:val="CodeBlock"/>
+      </w:pPr>
+      <w:r>
+        <w:t>PLATFORM=linux/arm64 docker compose build</w:t>
+      </w:r>
+    </w:p>
+    <w:p>
+      <w:pPr/>
+      <w:r>
+        <w:t>The pre-built .tar.gz image is x86-64. Apple-silicon Macs can run it under Rosetta emulation, but building natively for ARM is faster at runtime.</w:t>
       </w:r>
     </w:p>
     <w:p>

</xml_diff>

<commit_message>
let docker find the platform
</commit_message>
<xml_diff>
--- a/Docker/EITN/EITN_Setup_Guide.docx
+++ b/Docker/EITN/EITN_Setup_Guide.docx
@@ -604,7 +604,7 @@
     <w:p>
       <w:pPr/>
       <w:r>
-        <w:t>The pre-built image is x86-64 (Intel/AMD). On Apple-silicon Macs it runs under Rosetta emulation. For native ARM performance, use Option B with PLATFORM=linux/arm64 instead.</w:t>
+        <w:t>The pre-built image is x86-64 (Intel/AMD). On Apple-silicon Macs it runs under Rosetta emulation. For native ARM performance, use Option B instead.</w:t>
       </w:r>
     </w:p>
     <w:p>
@@ -634,21 +634,7 @@
     <w:p>
       <w:pPr/>
       <w:r>
-        <w:t>On a Mac with Apple silicon (M1/M2/M3/M4), build the ARM image instead:</w:t>
-      </w:r>
-    </w:p>
-    <w:p>
-      <w:pPr>
-        <w:pStyle w:val="CodeBlock"/>
-      </w:pPr>
-      <w:r>
-        <w:t>PLATFORM=linux/arm64 docker compose build</w:t>
-      </w:r>
-    </w:p>
-    <w:p>
-      <w:pPr/>
-      <w:r>
-        <w:t>The pre-built .tar.gz image is x86-64. Apple-silicon Macs can run it under Rosetta emulation, but building natively for ARM is faster at runtime.</w:t>
+        <w:t>The build automatically detects your platform (x86-64 or ARM). No extra flags are needed — Apple-silicon Macs get a native ARM image.</w:t>
       </w:r>
     </w:p>
     <w:p>

</xml_diff>